<commit_message>
Add final Ritmo pitch deck and video guide
</commit_message>
<xml_diff>
--- a/README.docx
+++ b/README.docx
@@ -944,6 +944,142 @@
           </w:p>
         </w:tc>
       </w:tr>
+      <w:tr>
+        <w:tc>
+          <w:tcPr>
+            <w:tcW w:type="dxa" w:w="3312"/>
+            <w:vAlign w:val="center"/>
+            <w:tcMar>
+              <w:top w:w="100" w:type="dxa"/>
+              <w:start w:w="120" w:type="dxa"/>
+              <w:bottom w:w="100" w:type="dxa"/>
+              <w:end w:w="120" w:type="dxa"/>
+            </w:tcMar>
+          </w:tcPr>
+          <w:p>
+            <w:pPr/>
+            <w:r>
+              <w:rPr>
+                <w:rFonts w:ascii="Arial" w:hAnsi="Arial"/>
+                <w:sz w:val="17"/>
+              </w:rPr>
+              <w:t>Pitch final</w:t>
+            </w:r>
+          </w:p>
+        </w:tc>
+        <w:tc>
+          <w:tcPr>
+            <w:tcW w:type="dxa" w:w="3312"/>
+            <w:vAlign w:val="center"/>
+            <w:tcMar>
+              <w:top w:w="100" w:type="dxa"/>
+              <w:start w:w="120" w:type="dxa"/>
+              <w:bottom w:w="100" w:type="dxa"/>
+              <w:end w:w="120" w:type="dxa"/>
+            </w:tcMar>
+          </w:tcPr>
+          <w:p>
+            <w:pPr/>
+            <w:r>
+              <w:rPr>
+                <w:rFonts w:ascii="Arial" w:hAnsi="Arial"/>
+                <w:sz w:val="17"/>
+              </w:rPr>
+              <w:t>05_Pitch_Final/Ritmo_Pitch_Final_5min.pptx y .pdf</w:t>
+            </w:r>
+          </w:p>
+        </w:tc>
+        <w:tc>
+          <w:tcPr>
+            <w:tcW w:type="dxa" w:w="3312"/>
+            <w:vAlign w:val="center"/>
+            <w:tcMar>
+              <w:top w:w="100" w:type="dxa"/>
+              <w:start w:w="120" w:type="dxa"/>
+              <w:bottom w:w="100" w:type="dxa"/>
+              <w:end w:w="120" w:type="dxa"/>
+            </w:tcMar>
+          </w:tcPr>
+          <w:p>
+            <w:pPr/>
+            <w:r>
+              <w:rPr>
+                <w:rFonts w:ascii="Arial" w:hAnsi="Arial"/>
+                <w:sz w:val="17"/>
+              </w:rPr>
+              <w:t>Completo; deck 16:9 de 10 slides</w:t>
+            </w:r>
+          </w:p>
+        </w:tc>
+      </w:tr>
+      <w:tr>
+        <w:tc>
+          <w:tcPr>
+            <w:tcW w:type="dxa" w:w="3312"/>
+            <w:vAlign w:val="center"/>
+            <w:tcMar>
+              <w:top w:w="100" w:type="dxa"/>
+              <w:start w:w="120" w:type="dxa"/>
+              <w:bottom w:w="100" w:type="dxa"/>
+              <w:end w:w="120" w:type="dxa"/>
+            </w:tcMar>
+          </w:tcPr>
+          <w:p>
+            <w:pPr/>
+            <w:r>
+              <w:rPr>
+                <w:rFonts w:ascii="Arial" w:hAnsi="Arial"/>
+                <w:sz w:val="17"/>
+              </w:rPr>
+              <w:t>Guion y control de entrega</w:t>
+            </w:r>
+          </w:p>
+        </w:tc>
+        <w:tc>
+          <w:tcPr>
+            <w:tcW w:type="dxa" w:w="3312"/>
+            <w:vAlign w:val="center"/>
+            <w:tcMar>
+              <w:top w:w="100" w:type="dxa"/>
+              <w:start w:w="120" w:type="dxa"/>
+              <w:bottom w:w="100" w:type="dxa"/>
+              <w:end w:w="120" w:type="dxa"/>
+            </w:tcMar>
+          </w:tcPr>
+          <w:p>
+            <w:pPr/>
+            <w:r>
+              <w:rPr>
+                <w:rFonts w:ascii="Arial" w:hAnsi="Arial"/>
+                <w:sz w:val="17"/>
+              </w:rPr>
+              <w:t>05_Pitch_Final/Guion_Pitch_Final_5min.md y Checklist_Entrega_Video.md</w:t>
+            </w:r>
+          </w:p>
+        </w:tc>
+        <w:tc>
+          <w:tcPr>
+            <w:tcW w:type="dxa" w:w="3312"/>
+            <w:vAlign w:val="center"/>
+            <w:tcMar>
+              <w:top w:w="100" w:type="dxa"/>
+              <w:start w:w="120" w:type="dxa"/>
+              <w:bottom w:w="100" w:type="dxa"/>
+              <w:end w:w="120" w:type="dxa"/>
+            </w:tcMar>
+          </w:tcPr>
+          <w:p>
+            <w:pPr/>
+            <w:r>
+              <w:rPr>
+                <w:rFonts w:ascii="Arial" w:hAnsi="Arial"/>
+                <w:sz w:val="17"/>
+              </w:rPr>
+              <w:t>Completo; objetivo 5:00</w:t>
+            </w:r>
+          </w:p>
+        </w:tc>
+      </w:tr>
     </w:tbl>
     <w:p>
       <w:pPr>
@@ -997,6 +1133,19 @@
     <w:p>
       <w:r>
         <w:t>Cinco sesiones simuladas bajo la metodologia excepcional del ejercicio. Resultado: 3/5 completo sin ayuda en &lt;=3:00, 4/5 sin ayuda en total, promedio 02:51 y un error critico. Se cumple exactamente el umbral; la decision es perseverar con la tarea core y refinar tres fricciones antes de EXP-02.</w:t>
+      </w:r>
+    </w:p>
+    <w:p>
+      <w:pPr>
+        <w:pStyle w:val="Heading1"/>
+      </w:pPr>
+      <w:r>
+        <w:t>Pitch final</w:t>
+      </w:r>
+    </w:p>
+    <w:p>
+      <w:r>
+        <w:t>La carpeta 05_Pitch_Final/ contiene el deck editable, el PDF solicitado para Canvas, el guion cronometrado con participacion de los cuatro integrantes y el checklist de grabacion y entrega. Las notas del presentador del .pptx incluyen el texto hablado y las fuentes externas de cada slide.</w:t>
       </w:r>
     </w:p>
     <w:sectPr>

</xml_diff>